<commit_message>
docs: update PRD and README with tactical mobile hamburger drawer specs
</commit_message>
<xml_diff>
--- a/RescueAI_PRD.docx
+++ b/RescueAI_PRD.docx
@@ -2509,7 +2509,44 @@
         <w:t>Animation &amp; Transitions</w:t>
       </w:r>
       <w:r>
-        <w:t>: Framer Motion 11.18</w:t>
+        <w:t>: Framer Motion 11.18 (Page transitions, Spring physics for mobile drawer)</w:t>
+      </w:r>
+    </w:p>
+    <w:p>
+      <w:pPr>
+        <w:pStyle w:val="ListBullet"/>
+        <w:spacing w:before="20" w:after="40" w:line="276" w:lineRule="auto"/>
+      </w:pPr>
+      <w:r>
+        <w:rPr>
+          <w:b/>
+        </w:rPr>
+        <w:t>Responsive Navigation</w:t>
+      </w:r>
+      <w:r>
+        <w:t>: Adaptive Tactical Hamburger Drawer (</w:t>
+      </w:r>
+      <w:r>
+        <w:rPr>
+          <w:rFonts w:ascii="Consolas" w:hAnsi="Consolas"/>
+          <w:color w:val="C7254E"/>
+          <w:sz w:val="19"/>
+        </w:rPr>
+        <w:t>&lt;= 960px</w:t>
+      </w:r>
+      <w:r>
+        <w:t>) unlocking 100% viewport width for cards and maps; full 264px persistent sidebar for desktop displays (</w:t>
+      </w:r>
+      <w:r>
+        <w:rPr>
+          <w:rFonts w:ascii="Consolas" w:hAnsi="Consolas"/>
+          <w:color w:val="C7254E"/>
+          <w:sz w:val="19"/>
+        </w:rPr>
+        <w:t>&gt; 960px</w:t>
+      </w:r>
+      <w:r>
+        <w:t>).</w:t>
       </w:r>
     </w:p>
     <w:p>
@@ -8344,7 +8381,20 @@
               <w:rPr>
                 <w:sz w:val="18"/>
               </w:rPr>
-              <w:t>Responsive flex/grid with touch-enabled 3D orbit controls</w:t>
+              <w:t>Tactical slide-out hamburger drawer (</w:t>
+            </w:r>
+            <w:r>
+              <w:rPr>
+                <w:rFonts w:ascii="Consolas" w:hAnsi="Consolas"/>
+                <w:sz w:val="18"/>
+              </w:rPr>
+              <w:t>&lt;= 960px</w:t>
+            </w:r>
+            <w:r>
+              <w:rPr>
+                <w:sz w:val="18"/>
+              </w:rPr>
+              <w:t>), responsive flex/grid, compact telemetry HUD, and touch-enabled 3D orbit controls</w:t>
             </w:r>
           </w:p>
         </w:tc>

</xml_diff>